<commit_message>
inputs, tutorial(w03): the solved Johnson companions and the report they document
The solved copy of the Johnson Reservoir dam carries the steady field its
workbook now solves, and the strength reduction run on that field. W-3's two
reports are rebuilt on it, and the page states the numbers they print: the
flow through the section, Bishop's and Spencer's searches, the attached
strength reduction, and the two sums each method's factor of safety is the
quotient of.

Co-Authored-By: Claude Fable 5.1 <noreply@anthropic.com>
Claude-Session: https://claude.ai/code/session_01XjjT2aBxw8gY7EFdpoUcpj
</commit_message>
<xml_diff>
--- a/docs/tutorials/files/w03_report_example_template.docx
+++ b/docs/tutorials/files/w03_report_example_template.docx
@@ -907,7 +907,7 @@
                 <w:b w:val="0"/>
                 <w:sz w:val="20"/>
               </w:rPr>
-              <w:t>2026-09-04 18:00</w:t>
+              <w:t>2026-09-05 03:54</w:t>
             </w:r>
           </w:p>
         </w:tc>
@@ -2453,7 +2453,7 @@
         <w:rPr>
           <w:b/>
         </w:rPr>
-        <w:t>1.925 ft³/day per ft</w:t>
+        <w:t>1.948 ft³/day per ft</w:t>
       </w:r>
       <w:r>
         <w:t>.</w:t>
@@ -2465,7 +2465,7 @@
         <w:keepNext/>
       </w:pPr>
       <w:r>
-        <w:t>The solution converged, closing the boundary inflow against the outflow to within 1.53e-08 ft³/day per ft.</w:t>
+        <w:t>The solution converged, closing the boundary inflow against the outflow to within 2.8e-08 ft³/day per ft.</w:t>
       </w:r>
     </w:p>
     <w:p>
@@ -4681,7 +4681,7 @@
                 <w:b w:val="0"/>
                 <w:sz w:val="20"/>
               </w:rPr>
-              <w:t>1.248 to 1.605</w:t>
+              <w:t>1.257 to 1.613</w:t>
             </w:r>
           </w:p>
         </w:tc>
@@ -4808,7 +4808,7 @@
         <w:rPr>
           <w:b/>
         </w:rPr>
-        <w:t>1.248</w:t>
+        <w:t>1.257</w:t>
       </w:r>
       <w:r>
         <w:t xml:space="preserve"> on the critical surface of </w:t>
@@ -5006,7 +5006,7 @@
     <w:tbl>
       <w:tblPr>
         <w:tblStyle w:val="TableGrid"/>
-        <w:tblW w:type="dxa" w:w="11046"/>
+        <w:tblW w:type="dxa" w:w="11043"/>
         <w:tblInd w:w="43" w:type="dxa"/>
         <w:tblLayout w:type="fixed"/>
         <w:tblCellMar>
@@ -5030,7 +5030,7 @@
         <w:gridCol w:w="346"/>
         <w:gridCol w:w="528"/>
         <w:gridCol w:w="593"/>
-        <w:gridCol w:w="756"/>
+        <w:gridCol w:w="753"/>
         <w:gridCol w:w="761"/>
         <w:gridCol w:w="691"/>
         <w:gridCol w:w="721"/>
@@ -5364,7 +5364,7 @@
         </w:tc>
         <w:tc>
           <w:tcPr>
-            <w:tcW w:type="dxa" w:w="756"/>
+            <w:tcW w:type="dxa" w:w="753"/>
             <w:vAlign w:val="center"/>
           </w:tcPr>
           <w:p>
@@ -5852,25 +5852,25 @@
         </w:tc>
         <w:tc>
           <w:tcPr>
-            <w:tcW w:type="dxa" w:w="756"/>
-            <w:noWrap/>
-            <w:vAlign w:val="center"/>
-          </w:tcPr>
-          <w:p>
-            <w:pPr>
-              <w:spacing w:before="0" w:after="0" w:line="240" w:lineRule="auto"/>
-              <w:jc w:val="center"/>
-              <w:rPr>
-                <w:sz w:val="14"/>
-                <w:szCs w:val="14"/>
-              </w:rPr>
-            </w:pPr>
-            <w:r>
-              <w:rPr>
-                <w:b w:val="0"/>
-                <w:sz w:val="14"/>
-              </w:rPr>
-              <w:t>9812.6</w:t>
+            <w:tcW w:type="dxa" w:w="753"/>
+            <w:noWrap/>
+            <w:vAlign w:val="center"/>
+          </w:tcPr>
+          <w:p>
+            <w:pPr>
+              <w:spacing w:before="0" w:after="0" w:line="240" w:lineRule="auto"/>
+              <w:jc w:val="center"/>
+              <w:rPr>
+                <w:sz w:val="14"/>
+                <w:szCs w:val="14"/>
+              </w:rPr>
+            </w:pPr>
+            <w:r>
+              <w:rPr>
+                <w:b w:val="0"/>
+                <w:sz w:val="14"/>
+              </w:rPr>
+              <w:t>9841.7</w:t>
             </w:r>
           </w:p>
         </w:tc>
@@ -5966,7 +5966,7 @@
                 <w:b w:val="0"/>
                 <w:sz w:val="14"/>
               </w:rPr>
-              <w:t>-4905.8</w:t>
+              <w:t>-4950.3</w:t>
             </w:r>
           </w:p>
         </w:tc>
@@ -6208,7 +6208,7 @@
                 <w:b w:val="0"/>
                 <w:sz w:val="14"/>
               </w:rPr>
-              <w:t>165.4</w:t>
+              <w:t>164.8</w:t>
             </w:r>
           </w:p>
         </w:tc>
@@ -6286,25 +6286,25 @@
         </w:tc>
         <w:tc>
           <w:tcPr>
-            <w:tcW w:type="dxa" w:w="756"/>
-            <w:noWrap/>
-            <w:vAlign w:val="center"/>
-          </w:tcPr>
-          <w:p>
-            <w:pPr>
-              <w:spacing w:before="0" w:after="0" w:line="240" w:lineRule="auto"/>
-              <w:jc w:val="center"/>
-              <w:rPr>
-                <w:sz w:val="14"/>
-                <w:szCs w:val="14"/>
-              </w:rPr>
-            </w:pPr>
-            <w:r>
-              <w:rPr>
-                <w:b w:val="0"/>
-                <w:sz w:val="14"/>
-              </w:rPr>
-              <w:t>10607.7</w:t>
+            <w:tcW w:type="dxa" w:w="753"/>
+            <w:noWrap/>
+            <w:vAlign w:val="center"/>
+          </w:tcPr>
+          <w:p>
+            <w:pPr>
+              <w:spacing w:before="0" w:after="0" w:line="240" w:lineRule="auto"/>
+              <w:jc w:val="center"/>
+              <w:rPr>
+                <w:sz w:val="14"/>
+                <w:szCs w:val="14"/>
+              </w:rPr>
+            </w:pPr>
+            <w:r>
+              <w:rPr>
+                <w:b w:val="0"/>
+                <w:sz w:val="14"/>
+              </w:rPr>
+              <w:t>10633.5</w:t>
             </w:r>
           </w:p>
         </w:tc>
@@ -6328,7 +6328,7 @@
                 <w:b w:val="0"/>
                 <w:sz w:val="14"/>
               </w:rPr>
-              <w:t>4905.8</w:t>
+              <w:t>4950.3</w:t>
             </w:r>
           </w:p>
         </w:tc>
@@ -6400,7 +6400,7 @@
                 <w:b w:val="0"/>
                 <w:sz w:val="14"/>
               </w:rPr>
-              <w:t>-6938.7</w:t>
+              <w:t>-6975.9</w:t>
             </w:r>
           </w:p>
         </w:tc>
@@ -6642,7 +6642,7 @@
                 <w:b w:val="0"/>
                 <w:sz w:val="14"/>
               </w:rPr>
-              <w:t>327.8</w:t>
+              <w:t>326.6</w:t>
             </w:r>
           </w:p>
         </w:tc>
@@ -6720,25 +6720,25 @@
         </w:tc>
         <w:tc>
           <w:tcPr>
-            <w:tcW w:type="dxa" w:w="756"/>
-            <w:noWrap/>
-            <w:vAlign w:val="center"/>
-          </w:tcPr>
-          <w:p>
-            <w:pPr>
-              <w:spacing w:before="0" w:after="0" w:line="240" w:lineRule="auto"/>
-              <w:jc w:val="center"/>
-              <w:rPr>
-                <w:sz w:val="14"/>
-                <w:szCs w:val="14"/>
-              </w:rPr>
-            </w:pPr>
-            <w:r>
-              <w:rPr>
-                <w:b w:val="0"/>
-                <w:sz w:val="14"/>
-              </w:rPr>
-              <w:t>22078.8</w:t>
+            <w:tcW w:type="dxa" w:w="753"/>
+            <w:noWrap/>
+            <w:vAlign w:val="center"/>
+          </w:tcPr>
+          <w:p>
+            <w:pPr>
+              <w:spacing w:before="0" w:after="0" w:line="240" w:lineRule="auto"/>
+              <w:jc w:val="center"/>
+              <w:rPr>
+                <w:sz w:val="14"/>
+                <w:szCs w:val="14"/>
+              </w:rPr>
+            </w:pPr>
+            <w:r>
+              <w:rPr>
+                <w:b w:val="0"/>
+                <w:sz w:val="14"/>
+              </w:rPr>
+              <w:t>22126.6</w:t>
             </w:r>
           </w:p>
         </w:tc>
@@ -6762,7 +6762,7 @@
                 <w:b w:val="0"/>
                 <w:sz w:val="14"/>
               </w:rPr>
-              <w:t>11844.5</w:t>
+              <w:t>11926.2</w:t>
             </w:r>
           </w:p>
         </w:tc>
@@ -6834,7 +6834,7 @@
                 <w:b w:val="0"/>
                 <w:sz w:val="14"/>
               </w:rPr>
-              <w:t>-15002.1</w:t>
+              <w:t>-15066.3</w:t>
             </w:r>
           </w:p>
         </w:tc>
@@ -7076,7 +7076,7 @@
                 <w:b w:val="0"/>
                 <w:sz w:val="14"/>
               </w:rPr>
-              <w:t>485.3</w:t>
+              <w:t>482.8</w:t>
             </w:r>
           </w:p>
         </w:tc>
@@ -7154,25 +7154,25 @@
         </w:tc>
         <w:tc>
           <w:tcPr>
-            <w:tcW w:type="dxa" w:w="756"/>
-            <w:noWrap/>
-            <w:vAlign w:val="center"/>
-          </w:tcPr>
-          <w:p>
-            <w:pPr>
-              <w:spacing w:before="0" w:after="0" w:line="240" w:lineRule="auto"/>
-              <w:jc w:val="center"/>
-              <w:rPr>
-                <w:sz w:val="14"/>
-                <w:szCs w:val="14"/>
-              </w:rPr>
-            </w:pPr>
-            <w:r>
-              <w:rPr>
-                <w:b w:val="0"/>
-                <w:sz w:val="14"/>
-              </w:rPr>
-              <w:t>27137.7</w:t>
+            <w:tcW w:type="dxa" w:w="753"/>
+            <w:noWrap/>
+            <w:vAlign w:val="center"/>
+          </w:tcPr>
+          <w:p>
+            <w:pPr>
+              <w:spacing w:before="0" w:after="0" w:line="240" w:lineRule="auto"/>
+              <w:jc w:val="center"/>
+              <w:rPr>
+                <w:sz w:val="14"/>
+                <w:szCs w:val="14"/>
+              </w:rPr>
+            </w:pPr>
+            <w:r>
+              <w:rPr>
+                <w:b w:val="0"/>
+                <w:sz w:val="14"/>
+              </w:rPr>
+              <w:t>27196.6</w:t>
             </w:r>
           </w:p>
         </w:tc>
@@ -7196,7 +7196,7 @@
                 <w:b w:val="0"/>
                 <w:sz w:val="14"/>
               </w:rPr>
-              <w:t>26846.6</w:t>
+              <w:t>26992.5</w:t>
             </w:r>
           </w:p>
         </w:tc>
@@ -7268,7 +7268,7 @@
                 <w:b w:val="0"/>
                 <w:sz w:val="14"/>
               </w:rPr>
-              <w:t>-17882.4</w:t>
+              <w:t>-17949.9</w:t>
             </w:r>
           </w:p>
         </w:tc>
@@ -7510,7 +7510,7 @@
                 <w:b w:val="0"/>
                 <w:sz w:val="14"/>
               </w:rPr>
-              <w:t>598.3</w:t>
+              <w:t>594.4</w:t>
             </w:r>
           </w:p>
         </w:tc>
@@ -7588,25 +7588,25 @@
         </w:tc>
         <w:tc>
           <w:tcPr>
-            <w:tcW w:type="dxa" w:w="756"/>
-            <w:noWrap/>
-            <w:vAlign w:val="center"/>
-          </w:tcPr>
-          <w:p>
-            <w:pPr>
-              <w:spacing w:before="0" w:after="0" w:line="240" w:lineRule="auto"/>
-              <w:jc w:val="center"/>
-              <w:rPr>
-                <w:sz w:val="14"/>
-                <w:szCs w:val="14"/>
-              </w:rPr>
-            </w:pPr>
-            <w:r>
-              <w:rPr>
-                <w:b w:val="0"/>
-                <w:sz w:val="14"/>
-              </w:rPr>
-              <w:t>31843.9</w:t>
+            <w:tcW w:type="dxa" w:w="753"/>
+            <w:noWrap/>
+            <w:vAlign w:val="center"/>
+          </w:tcPr>
+          <w:p>
+            <w:pPr>
+              <w:spacing w:before="0" w:after="0" w:line="240" w:lineRule="auto"/>
+              <w:jc w:val="center"/>
+              <w:rPr>
+                <w:sz w:val="14"/>
+                <w:szCs w:val="14"/>
+              </w:rPr>
+            </w:pPr>
+            <w:r>
+              <w:rPr>
+                <w:b w:val="0"/>
+                <w:sz w:val="14"/>
+              </w:rPr>
+              <w:t>31912.2</w:t>
             </w:r>
           </w:p>
         </w:tc>
@@ -7630,7 +7630,7 @@
                 <w:b w:val="0"/>
                 <w:sz w:val="14"/>
               </w:rPr>
-              <w:t>44729.0</w:t>
+              <w:t>44942.4</w:t>
             </w:r>
           </w:p>
         </w:tc>
@@ -7702,7 +7702,7 @@
                 <w:b w:val="0"/>
                 <w:sz w:val="14"/>
               </w:rPr>
-              <w:t>-19599.4</w:t>
+              <w:t>-19670.7</w:t>
             </w:r>
           </w:p>
         </w:tc>
@@ -7944,7 +7944,7 @@
                 <w:b w:val="0"/>
                 <w:sz w:val="14"/>
               </w:rPr>
-              <w:t>661.3</w:t>
+              <w:t>655.7</w:t>
             </w:r>
           </w:p>
         </w:tc>
@@ -8022,25 +8022,25 @@
         </w:tc>
         <w:tc>
           <w:tcPr>
-            <w:tcW w:type="dxa" w:w="756"/>
-            <w:noWrap/>
-            <w:vAlign w:val="center"/>
-          </w:tcPr>
-          <w:p>
-            <w:pPr>
-              <w:spacing w:before="0" w:after="0" w:line="240" w:lineRule="auto"/>
-              <w:jc w:val="center"/>
-              <w:rPr>
-                <w:sz w:val="14"/>
-                <w:szCs w:val="14"/>
-              </w:rPr>
-            </w:pPr>
-            <w:r>
-              <w:rPr>
-                <w:b w:val="0"/>
-                <w:sz w:val="14"/>
-              </w:rPr>
-              <w:t>35251.0</w:t>
+            <w:tcW w:type="dxa" w:w="753"/>
+            <w:noWrap/>
+            <w:vAlign w:val="center"/>
+          </w:tcPr>
+          <w:p>
+            <w:pPr>
+              <w:spacing w:before="0" w:after="0" w:line="240" w:lineRule="auto"/>
+              <w:jc w:val="center"/>
+              <w:rPr>
+                <w:sz w:val="14"/>
+                <w:szCs w:val="14"/>
+              </w:rPr>
+            </w:pPr>
+            <w:r>
+              <w:rPr>
+                <w:b w:val="0"/>
+                <w:sz w:val="14"/>
+              </w:rPr>
+              <w:t>35330.0</w:t>
             </w:r>
           </w:p>
         </w:tc>
@@ -8064,7 +8064,7 @@
                 <w:b w:val="0"/>
                 <w:sz w:val="14"/>
               </w:rPr>
-              <w:t>64328.4</w:t>
+              <w:t>64613.1</w:t>
             </w:r>
           </w:p>
         </w:tc>
@@ -8136,7 +8136,7 @@
                 <w:b w:val="0"/>
                 <w:sz w:val="14"/>
               </w:rPr>
-              <w:t>-19830.6</w:t>
+              <w:t>-19903.1</w:t>
             </w:r>
           </w:p>
         </w:tc>
@@ -8378,7 +8378,7 @@
                 <w:b w:val="0"/>
                 <w:sz w:val="14"/>
               </w:rPr>
-              <w:t>680.5</w:t>
+              <w:t>673.1</w:t>
             </w:r>
           </w:p>
         </w:tc>
@@ -8456,25 +8456,25 @@
         </w:tc>
         <w:tc>
           <w:tcPr>
-            <w:tcW w:type="dxa" w:w="756"/>
-            <w:noWrap/>
-            <w:vAlign w:val="center"/>
-          </w:tcPr>
-          <w:p>
-            <w:pPr>
-              <w:spacing w:before="0" w:after="0" w:line="240" w:lineRule="auto"/>
-              <w:jc w:val="center"/>
-              <w:rPr>
-                <w:sz w:val="14"/>
-                <w:szCs w:val="14"/>
-              </w:rPr>
-            </w:pPr>
-            <w:r>
-              <w:rPr>
-                <w:b w:val="0"/>
-                <w:sz w:val="14"/>
-              </w:rPr>
-              <w:t>37431.0</w:t>
+            <w:tcW w:type="dxa" w:w="753"/>
+            <w:noWrap/>
+            <w:vAlign w:val="center"/>
+          </w:tcPr>
+          <w:p>
+            <w:pPr>
+              <w:spacing w:before="0" w:after="0" w:line="240" w:lineRule="auto"/>
+              <w:jc w:val="center"/>
+              <w:rPr>
+                <w:sz w:val="14"/>
+                <w:szCs w:val="14"/>
+              </w:rPr>
+            </w:pPr>
+            <w:r>
+              <w:rPr>
+                <w:b w:val="0"/>
+                <w:sz w:val="14"/>
+              </w:rPr>
+              <w:t>37520.5</w:t>
             </w:r>
           </w:p>
         </w:tc>
@@ -8498,7 +8498,7 @@
                 <w:b w:val="0"/>
                 <w:sz w:val="14"/>
               </w:rPr>
-              <w:t>84159.0</w:t>
+              <w:t>84516.2</w:t>
             </w:r>
           </w:p>
         </w:tc>
@@ -8570,7 +8570,7 @@
                 <w:b w:val="0"/>
                 <w:sz w:val="14"/>
               </w:rPr>
-              <w:t>-18935.1</w:t>
+              <w:t>-19006.8</w:t>
             </w:r>
           </w:p>
         </w:tc>
@@ -8812,7 +8812,7 @@
                 <w:b w:val="0"/>
                 <w:sz w:val="14"/>
               </w:rPr>
-              <w:t>673.4</w:t>
+              <w:t>663.4</w:t>
             </w:r>
           </w:p>
         </w:tc>
@@ -8890,25 +8890,25 @@
         </w:tc>
         <w:tc>
           <w:tcPr>
-            <w:tcW w:type="dxa" w:w="756"/>
-            <w:noWrap/>
-            <w:vAlign w:val="center"/>
-          </w:tcPr>
-          <w:p>
-            <w:pPr>
-              <w:spacing w:before="0" w:after="0" w:line="240" w:lineRule="auto"/>
-              <w:jc w:val="center"/>
-              <w:rPr>
-                <w:sz w:val="14"/>
-                <w:szCs w:val="14"/>
-              </w:rPr>
-            </w:pPr>
-            <w:r>
-              <w:rPr>
-                <w:b w:val="0"/>
-                <w:sz w:val="14"/>
-              </w:rPr>
-              <w:t>39431.9</w:t>
+            <w:tcW w:type="dxa" w:w="753"/>
+            <w:noWrap/>
+            <w:vAlign w:val="center"/>
+          </w:tcPr>
+          <w:p>
+            <w:pPr>
+              <w:spacing w:before="0" w:after="0" w:line="240" w:lineRule="auto"/>
+              <w:jc w:val="center"/>
+              <w:rPr>
+                <w:sz w:val="14"/>
+                <w:szCs w:val="14"/>
+              </w:rPr>
+            </w:pPr>
+            <w:r>
+              <w:rPr>
+                <w:b w:val="0"/>
+                <w:sz w:val="14"/>
+              </w:rPr>
+              <w:t>39537.7</w:t>
             </w:r>
           </w:p>
         </w:tc>
@@ -8932,7 +8932,7 @@
                 <w:b w:val="0"/>
                 <w:sz w:val="14"/>
               </w:rPr>
-              <w:t>103094.1</w:t>
+              <w:t>103523.0</w:t>
             </w:r>
           </w:p>
         </w:tc>
@@ -9004,7 +9004,7 @@
                 <w:b w:val="0"/>
                 <w:sz w:val="14"/>
               </w:rPr>
-              <w:t>-17680.4</w:t>
+              <w:t>-17749.7</w:t>
             </w:r>
           </w:p>
         </w:tc>
@@ -9246,7 +9246,7 @@
                 <w:b w:val="0"/>
                 <w:sz w:val="14"/>
               </w:rPr>
-              <w:t>665.9</w:t>
+              <w:t>651.0</w:t>
             </w:r>
           </w:p>
         </w:tc>
@@ -9324,25 +9324,25 @@
         </w:tc>
         <w:tc>
           <w:tcPr>
-            <w:tcW w:type="dxa" w:w="756"/>
-            <w:noWrap/>
-            <w:vAlign w:val="center"/>
-          </w:tcPr>
-          <w:p>
-            <w:pPr>
-              <w:spacing w:before="0" w:after="0" w:line="240" w:lineRule="auto"/>
-              <w:jc w:val="center"/>
-              <w:rPr>
-                <w:sz w:val="14"/>
-                <w:szCs w:val="14"/>
-              </w:rPr>
-            </w:pPr>
-            <w:r>
-              <w:rPr>
-                <w:b w:val="0"/>
-                <w:sz w:val="14"/>
-              </w:rPr>
-              <w:t>41108.9</w:t>
+            <w:tcW w:type="dxa" w:w="753"/>
+            <w:noWrap/>
+            <w:vAlign w:val="center"/>
+          </w:tcPr>
+          <w:p>
+            <w:pPr>
+              <w:spacing w:before="0" w:after="0" w:line="240" w:lineRule="auto"/>
+              <w:jc w:val="center"/>
+              <w:rPr>
+                <w:sz w:val="14"/>
+                <w:szCs w:val="14"/>
+              </w:rPr>
+            </w:pPr>
+            <w:r>
+              <w:rPr>
+                <w:b w:val="0"/>
+                <w:sz w:val="14"/>
+              </w:rPr>
+              <w:t>41247.0</w:t>
             </w:r>
           </w:p>
         </w:tc>
@@ -9366,7 +9366,7 @@
                 <w:b w:val="0"/>
                 <w:sz w:val="14"/>
               </w:rPr>
-              <w:t>120774.4</w:t>
+              <w:t>121272.7</w:t>
             </w:r>
           </w:p>
         </w:tc>
@@ -9438,7 +9438,7 @@
                 <w:b w:val="0"/>
                 <w:sz w:val="14"/>
               </w:rPr>
-              <w:t>-16192.5</w:t>
+              <w:t>-16254.9</w:t>
             </w:r>
           </w:p>
         </w:tc>
@@ -9680,7 +9680,7 @@
                 <w:b w:val="0"/>
                 <w:sz w:val="14"/>
               </w:rPr>
-              <w:t>703.8</w:t>
+              <w:t>677.3</w:t>
             </w:r>
           </w:p>
         </w:tc>
@@ -9758,25 +9758,25 @@
         </w:tc>
         <w:tc>
           <w:tcPr>
-            <w:tcW w:type="dxa" w:w="756"/>
-            <w:noWrap/>
-            <w:vAlign w:val="center"/>
-          </w:tcPr>
-          <w:p>
-            <w:pPr>
-              <w:spacing w:before="0" w:after="0" w:line="240" w:lineRule="auto"/>
-              <w:jc w:val="center"/>
-              <w:rPr>
-                <w:sz w:val="14"/>
-                <w:szCs w:val="14"/>
-              </w:rPr>
-            </w:pPr>
-            <w:r>
-              <w:rPr>
-                <w:b w:val="0"/>
-                <w:sz w:val="14"/>
-              </w:rPr>
-              <w:t>42170.0</w:t>
+            <w:tcW w:type="dxa" w:w="753"/>
+            <w:noWrap/>
+            <w:vAlign w:val="center"/>
+          </w:tcPr>
+          <w:p>
+            <w:pPr>
+              <w:spacing w:before="0" w:after="0" w:line="240" w:lineRule="auto"/>
+              <w:jc w:val="center"/>
+              <w:rPr>
+                <w:sz w:val="14"/>
+                <w:szCs w:val="14"/>
+              </w:rPr>
+            </w:pPr>
+            <w:r>
+              <w:rPr>
+                <w:b w:val="0"/>
+                <w:sz w:val="14"/>
+              </w:rPr>
+              <w:t>42387.5</w:t>
             </w:r>
           </w:p>
         </w:tc>
@@ -9800,7 +9800,7 @@
                 <w:b w:val="0"/>
                 <w:sz w:val="14"/>
               </w:rPr>
-              <w:t>136967.0</w:t>
+              <w:t>137527.5</w:t>
             </w:r>
           </w:p>
         </w:tc>
@@ -9872,7 +9872,7 @@
                 <w:b w:val="0"/>
                 <w:sz w:val="14"/>
               </w:rPr>
-              <w:t>-14614.5</w:t>
+              <w:t>-14656.4</w:t>
             </w:r>
           </w:p>
         </w:tc>
@@ -10114,7 +10114,7 @@
                 <w:b w:val="0"/>
                 <w:sz w:val="14"/>
               </w:rPr>
-              <w:t>805.6</w:t>
+              <w:t>772.7</w:t>
             </w:r>
           </w:p>
         </w:tc>
@@ -10192,25 +10192,25 @@
         </w:tc>
         <w:tc>
           <w:tcPr>
-            <w:tcW w:type="dxa" w:w="756"/>
-            <w:noWrap/>
-            <w:vAlign w:val="center"/>
-          </w:tcPr>
-          <w:p>
-            <w:pPr>
-              <w:spacing w:before="0" w:after="0" w:line="240" w:lineRule="auto"/>
-              <w:jc w:val="center"/>
-              <w:rPr>
-                <w:sz w:val="14"/>
-                <w:szCs w:val="14"/>
-              </w:rPr>
-            </w:pPr>
-            <w:r>
-              <w:rPr>
-                <w:b w:val="0"/>
-                <w:sz w:val="14"/>
-              </w:rPr>
-              <w:t>42529.3</w:t>
+            <w:tcW w:type="dxa" w:w="753"/>
+            <w:noWrap/>
+            <w:vAlign w:val="center"/>
+          </w:tcPr>
+          <w:p>
+            <w:pPr>
+              <w:spacing w:before="0" w:after="0" w:line="240" w:lineRule="auto"/>
+              <w:jc w:val="center"/>
+              <w:rPr>
+                <w:sz w:val="14"/>
+                <w:szCs w:val="14"/>
+              </w:rPr>
+            </w:pPr>
+            <w:r>
+              <w:rPr>
+                <w:b w:val="0"/>
+                <w:sz w:val="14"/>
+              </w:rPr>
+              <w:t>42787.6</w:t>
             </w:r>
           </w:p>
         </w:tc>
@@ -10234,7 +10234,7 @@
                 <w:b w:val="0"/>
                 <w:sz w:val="14"/>
               </w:rPr>
-              <w:t>151581.5</w:t>
+              <w:t>152183.9</w:t>
             </w:r>
           </w:p>
         </w:tc>
@@ -10306,7 +10306,7 @@
                 <w:b w:val="0"/>
                 <w:sz w:val="14"/>
               </w:rPr>
-              <w:t>-13016.7</w:t>
+              <w:t>-13047.7</w:t>
             </w:r>
           </w:p>
         </w:tc>
@@ -10548,7 +10548,7 @@
                 <w:b w:val="0"/>
                 <w:sz w:val="14"/>
               </w:rPr>
-              <w:t>1001.8</w:t>
+              <w:t>967.8</w:t>
             </w:r>
           </w:p>
         </w:tc>
@@ -10626,25 +10626,25 @@
         </w:tc>
         <w:tc>
           <w:tcPr>
-            <w:tcW w:type="dxa" w:w="756"/>
-            <w:noWrap/>
-            <w:vAlign w:val="center"/>
-          </w:tcPr>
-          <w:p>
-            <w:pPr>
-              <w:spacing w:before="0" w:after="0" w:line="240" w:lineRule="auto"/>
-              <w:jc w:val="center"/>
-              <w:rPr>
-                <w:sz w:val="14"/>
-                <w:szCs w:val="14"/>
-              </w:rPr>
-            </w:pPr>
-            <w:r>
-              <w:rPr>
-                <w:b w:val="0"/>
-                <w:sz w:val="14"/>
-              </w:rPr>
-              <w:t>38125.0</w:t>
+            <w:tcW w:type="dxa" w:w="753"/>
+            <w:noWrap/>
+            <w:vAlign w:val="center"/>
+          </w:tcPr>
+          <w:p>
+            <w:pPr>
+              <w:spacing w:before="0" w:after="0" w:line="240" w:lineRule="auto"/>
+              <w:jc w:val="center"/>
+              <w:rPr>
+                <w:sz w:val="14"/>
+                <w:szCs w:val="14"/>
+              </w:rPr>
+            </w:pPr>
+            <w:r>
+              <w:rPr>
+                <w:b w:val="0"/>
+                <w:sz w:val="14"/>
+              </w:rPr>
+              <w:t>38365.3</w:t>
             </w:r>
           </w:p>
         </w:tc>
@@ -10668,7 +10668,7 @@
                 <w:b w:val="0"/>
                 <w:sz w:val="14"/>
               </w:rPr>
-              <w:t>164598.3</w:t>
+              <w:t>165231.6</w:t>
             </w:r>
           </w:p>
         </w:tc>
@@ -10740,7 +10740,7 @@
                 <w:b w:val="0"/>
                 <w:sz w:val="14"/>
               </w:rPr>
-              <w:t>-6865.5</w:t>
+              <w:t>-6884.2</w:t>
             </w:r>
           </w:p>
         </w:tc>
@@ -10982,7 +10982,7 @@
                 <w:b w:val="0"/>
                 <w:sz w:val="14"/>
               </w:rPr>
-              <w:t>1209.2</w:t>
+              <w:t>1174.9</w:t>
             </w:r>
           </w:p>
         </w:tc>
@@ -11060,25 +11060,25 @@
         </w:tc>
         <w:tc>
           <w:tcPr>
-            <w:tcW w:type="dxa" w:w="756"/>
-            <w:noWrap/>
-            <w:vAlign w:val="center"/>
-          </w:tcPr>
-          <w:p>
-            <w:pPr>
-              <w:spacing w:before="0" w:after="0" w:line="240" w:lineRule="auto"/>
-              <w:jc w:val="center"/>
-              <w:rPr>
-                <w:sz w:val="14"/>
-                <w:szCs w:val="14"/>
-              </w:rPr>
-            </w:pPr>
-            <w:r>
-              <w:rPr>
-                <w:b w:val="0"/>
-                <w:sz w:val="14"/>
-              </w:rPr>
-              <w:t>37247.5</w:t>
+            <w:tcW w:type="dxa" w:w="753"/>
+            <w:noWrap/>
+            <w:vAlign w:val="center"/>
+          </w:tcPr>
+          <w:p>
+            <w:pPr>
+              <w:spacing w:before="0" w:after="0" w:line="240" w:lineRule="auto"/>
+              <w:jc w:val="center"/>
+              <w:rPr>
+                <w:sz w:val="14"/>
+                <w:szCs w:val="14"/>
+              </w:rPr>
+            </w:pPr>
+            <w:r>
+              <w:rPr>
+                <w:b w:val="0"/>
+                <w:sz w:val="14"/>
+              </w:rPr>
+              <w:t>37484.0</w:t>
             </w:r>
           </w:p>
         </w:tc>
@@ -11102,7 +11102,7 @@
                 <w:b w:val="0"/>
                 <w:sz w:val="14"/>
               </w:rPr>
-              <w:t>171463.8</w:t>
+              <w:t>172115.9</w:t>
             </w:r>
           </w:p>
         </w:tc>
@@ -11174,7 +11174,7 @@
                 <w:b w:val="0"/>
                 <w:sz w:val="14"/>
               </w:rPr>
-              <w:t>-5548.0</w:t>
+              <w:t>-5565.6</w:t>
             </w:r>
           </w:p>
         </w:tc>
@@ -11416,7 +11416,7 @@
                 <w:b w:val="0"/>
                 <w:sz w:val="14"/>
               </w:rPr>
-              <w:t>1384.2</w:t>
+              <w:t>1349.7</w:t>
             </w:r>
           </w:p>
         </w:tc>
@@ -11494,25 +11494,25 @@
         </w:tc>
         <w:tc>
           <w:tcPr>
-            <w:tcW w:type="dxa" w:w="756"/>
-            <w:noWrap/>
-            <w:vAlign w:val="center"/>
-          </w:tcPr>
-          <w:p>
-            <w:pPr>
-              <w:spacing w:before="0" w:after="0" w:line="240" w:lineRule="auto"/>
-              <w:jc w:val="center"/>
-              <w:rPr>
-                <w:sz w:val="14"/>
-                <w:szCs w:val="14"/>
-              </w:rPr>
-            </w:pPr>
-            <w:r>
-              <w:rPr>
-                <w:b w:val="0"/>
-                <w:sz w:val="14"/>
-              </w:rPr>
-              <w:t>36449.9</w:t>
+            <w:tcW w:type="dxa" w:w="753"/>
+            <w:noWrap/>
+            <w:vAlign w:val="center"/>
+          </w:tcPr>
+          <w:p>
+            <w:pPr>
+              <w:spacing w:before="0" w:after="0" w:line="240" w:lineRule="auto"/>
+              <w:jc w:val="center"/>
+              <w:rPr>
+                <w:sz w:val="14"/>
+                <w:szCs w:val="14"/>
+              </w:rPr>
+            </w:pPr>
+            <w:r>
+              <w:rPr>
+                <w:b w:val="0"/>
+                <w:sz w:val="14"/>
+              </w:rPr>
+              <w:t>36684.2</w:t>
             </w:r>
           </w:p>
         </w:tc>
@@ -11536,7 +11536,7 @@
                 <w:b w:val="0"/>
                 <w:sz w:val="14"/>
               </w:rPr>
-              <w:t>177011.8</w:t>
+              <w:t>177681.5</w:t>
             </w:r>
           </w:p>
         </w:tc>
@@ -11608,7 +11608,7 @@
                 <w:b w:val="0"/>
                 <w:sz w:val="14"/>
               </w:rPr>
-              <w:t>-4138.6</w:t>
+              <w:t>-4154.6</w:t>
             </w:r>
           </w:p>
         </w:tc>
@@ -11850,7 +11850,7 @@
                 <w:b w:val="0"/>
                 <w:sz w:val="14"/>
               </w:rPr>
-              <w:t>1533.2</w:t>
+              <w:t>1498.2</w:t>
             </w:r>
           </w:p>
         </w:tc>
@@ -11928,25 +11928,25 @@
         </w:tc>
         <w:tc>
           <w:tcPr>
-            <w:tcW w:type="dxa" w:w="756"/>
-            <w:noWrap/>
-            <w:vAlign w:val="center"/>
-          </w:tcPr>
-          <w:p>
-            <w:pPr>
-              <w:spacing w:before="0" w:after="0" w:line="240" w:lineRule="auto"/>
-              <w:jc w:val="center"/>
-              <w:rPr>
-                <w:sz w:val="14"/>
-                <w:szCs w:val="14"/>
-              </w:rPr>
-            </w:pPr>
-            <w:r>
-              <w:rPr>
-                <w:b w:val="0"/>
-                <w:sz w:val="14"/>
-              </w:rPr>
-              <w:t>35671.3</w:t>
+            <w:tcW w:type="dxa" w:w="753"/>
+            <w:noWrap/>
+            <w:vAlign w:val="center"/>
+          </w:tcPr>
+          <w:p>
+            <w:pPr>
+              <w:spacing w:before="0" w:after="0" w:line="240" w:lineRule="auto"/>
+              <w:jc w:val="center"/>
+              <w:rPr>
+                <w:sz w:val="14"/>
+                <w:szCs w:val="14"/>
+              </w:rPr>
+            </w:pPr>
+            <w:r>
+              <w:rPr>
+                <w:b w:val="0"/>
+                <w:sz w:val="14"/>
+              </w:rPr>
+              <w:t>35904.6</w:t>
             </w:r>
           </w:p>
         </w:tc>
@@ -11970,7 +11970,7 @@
                 <w:b w:val="0"/>
                 <w:sz w:val="14"/>
               </w:rPr>
-              <w:t>181150.4</w:t>
+              <w:t>181836.1</w:t>
             </w:r>
           </w:p>
         </w:tc>
@@ -12042,7 +12042,7 @@
                 <w:b w:val="0"/>
                 <w:sz w:val="14"/>
               </w:rPr>
-              <w:t>-2671.6</w:t>
+              <w:t>-2685.7</w:t>
             </w:r>
           </w:p>
         </w:tc>
@@ -12284,7 +12284,7 @@
                 <w:b w:val="0"/>
                 <w:sz w:val="14"/>
               </w:rPr>
-              <w:t>1659.5</w:t>
+              <w:t>1624.0</w:t>
             </w:r>
           </w:p>
         </w:tc>
@@ -12362,25 +12362,25 @@
         </w:tc>
         <w:tc>
           <w:tcPr>
-            <w:tcW w:type="dxa" w:w="756"/>
-            <w:noWrap/>
-            <w:vAlign w:val="center"/>
-          </w:tcPr>
-          <w:p>
-            <w:pPr>
-              <w:spacing w:before="0" w:after="0" w:line="240" w:lineRule="auto"/>
-              <w:jc w:val="center"/>
-              <w:rPr>
-                <w:sz w:val="14"/>
-                <w:szCs w:val="14"/>
-              </w:rPr>
-            </w:pPr>
-            <w:r>
-              <w:rPr>
-                <w:b w:val="0"/>
-                <w:sz w:val="14"/>
-              </w:rPr>
-              <w:t>34888.1</w:t>
+            <w:tcW w:type="dxa" w:w="753"/>
+            <w:noWrap/>
+            <w:vAlign w:val="center"/>
+          </w:tcPr>
+          <w:p>
+            <w:pPr>
+              <w:spacing w:before="0" w:after="0" w:line="240" w:lineRule="auto"/>
+              <w:jc w:val="center"/>
+              <w:rPr>
+                <w:sz w:val="14"/>
+                <w:szCs w:val="14"/>
+              </w:rPr>
+            </w:pPr>
+            <w:r>
+              <w:rPr>
+                <w:b w:val="0"/>
+                <w:sz w:val="14"/>
+              </w:rPr>
+              <w:t>35121.1</w:t>
             </w:r>
           </w:p>
         </w:tc>
@@ -12404,7 +12404,7 @@
                 <w:b w:val="0"/>
                 <w:sz w:val="14"/>
               </w:rPr>
-              <w:t>183822.0</w:t>
+              <w:t>184521.9</w:t>
             </w:r>
           </w:p>
         </w:tc>
@@ -12476,7 +12476,7 @@
                 <w:b w:val="0"/>
                 <w:sz w:val="14"/>
               </w:rPr>
-              <w:t>-1175.3</w:t>
+              <w:t>-1187.1</w:t>
             </w:r>
           </w:p>
         </w:tc>
@@ -12718,7 +12718,7 @@
                 <w:b w:val="0"/>
                 <w:sz w:val="14"/>
               </w:rPr>
-              <w:t>1765.5</w:t>
+              <w:t>1729.5</w:t>
             </w:r>
           </w:p>
         </w:tc>
@@ -12796,25 +12796,25 @@
         </w:tc>
         <w:tc>
           <w:tcPr>
-            <w:tcW w:type="dxa" w:w="756"/>
-            <w:noWrap/>
-            <w:vAlign w:val="center"/>
-          </w:tcPr>
-          <w:p>
-            <w:pPr>
-              <w:spacing w:before="0" w:after="0" w:line="240" w:lineRule="auto"/>
-              <w:jc w:val="center"/>
-              <w:rPr>
-                <w:sz w:val="14"/>
-                <w:szCs w:val="14"/>
-              </w:rPr>
-            </w:pPr>
-            <w:r>
-              <w:rPr>
-                <w:b w:val="0"/>
-                <w:sz w:val="14"/>
-              </w:rPr>
-              <w:t>34082.9</w:t>
+            <w:tcW w:type="dxa" w:w="753"/>
+            <w:noWrap/>
+            <w:vAlign w:val="center"/>
+          </w:tcPr>
+          <w:p>
+            <w:pPr>
+              <w:spacing w:before="0" w:after="0" w:line="240" w:lineRule="auto"/>
+              <w:jc w:val="center"/>
+              <w:rPr>
+                <w:sz w:val="14"/>
+                <w:szCs w:val="14"/>
+              </w:rPr>
+            </w:pPr>
+            <w:r>
+              <w:rPr>
+                <w:b w:val="0"/>
+                <w:sz w:val="14"/>
+              </w:rPr>
+              <w:t>34316.4</w:t>
             </w:r>
           </w:p>
         </w:tc>
@@ -12838,7 +12838,7 @@
                 <w:b w:val="0"/>
                 <w:sz w:val="14"/>
               </w:rPr>
-              <w:t>184997.3</w:t>
+              <w:t>185709.0</w:t>
             </w:r>
           </w:p>
         </w:tc>
@@ -12910,7 +12910,7 @@
                 <w:b w:val="0"/>
                 <w:sz w:val="14"/>
               </w:rPr>
-              <w:t>326.4</w:t>
+              <w:t>317.2</w:t>
             </w:r>
           </w:p>
         </w:tc>
@@ -13152,7 +13152,7 @@
                 <w:b w:val="0"/>
                 <w:sz w:val="14"/>
               </w:rPr>
-              <w:t>1852.8</w:t>
+              <w:t>1816.2</w:t>
             </w:r>
           </w:p>
         </w:tc>
@@ -13230,25 +13230,25 @@
         </w:tc>
         <w:tc>
           <w:tcPr>
-            <w:tcW w:type="dxa" w:w="756"/>
-            <w:noWrap/>
-            <w:vAlign w:val="center"/>
-          </w:tcPr>
-          <w:p>
-            <w:pPr>
-              <w:spacing w:before="0" w:after="0" w:line="240" w:lineRule="auto"/>
-              <w:jc w:val="center"/>
-              <w:rPr>
-                <w:sz w:val="14"/>
-                <w:szCs w:val="14"/>
-              </w:rPr>
-            </w:pPr>
-            <w:r>
-              <w:rPr>
-                <w:b w:val="0"/>
-                <w:sz w:val="14"/>
-              </w:rPr>
-              <w:t>33243.0</w:t>
+            <w:tcW w:type="dxa" w:w="753"/>
+            <w:noWrap/>
+            <w:vAlign w:val="center"/>
+          </w:tcPr>
+          <w:p>
+            <w:pPr>
+              <w:spacing w:before="0" w:after="0" w:line="240" w:lineRule="auto"/>
+              <w:jc w:val="center"/>
+              <w:rPr>
+                <w:sz w:val="14"/>
+                <w:szCs w:val="14"/>
+              </w:rPr>
+            </w:pPr>
+            <w:r>
+              <w:rPr>
+                <w:b w:val="0"/>
+                <w:sz w:val="14"/>
+              </w:rPr>
+              <w:t>33478.2</w:t>
             </w:r>
           </w:p>
         </w:tc>
@@ -13272,7 +13272,7 @@
                 <w:b w:val="0"/>
                 <w:sz w:val="14"/>
               </w:rPr>
-              <w:t>184670.9</w:t>
+              <w:t>185391.8</w:t>
             </w:r>
           </w:p>
         </w:tc>
@@ -13344,7 +13344,7 @@
                 <w:b w:val="0"/>
                 <w:sz w:val="14"/>
               </w:rPr>
-              <w:t>1812.9</w:t>
+              <w:t>1806.9</w:t>
             </w:r>
           </w:p>
         </w:tc>
@@ -13586,7 +13586,7 @@
                 <w:b w:val="0"/>
                 <w:sz w:val="14"/>
               </w:rPr>
-              <w:t>1922.7</w:t>
+              <w:t>1885.3</w:t>
             </w:r>
           </w:p>
         </w:tc>
@@ -13664,25 +13664,25 @@
         </w:tc>
         <w:tc>
           <w:tcPr>
-            <w:tcW w:type="dxa" w:w="756"/>
-            <w:noWrap/>
-            <w:vAlign w:val="center"/>
-          </w:tcPr>
-          <w:p>
-            <w:pPr>
-              <w:spacing w:before="0" w:after="0" w:line="240" w:lineRule="auto"/>
-              <w:jc w:val="center"/>
-              <w:rPr>
-                <w:sz w:val="14"/>
-                <w:szCs w:val="14"/>
-              </w:rPr>
-            </w:pPr>
-            <w:r>
-              <w:rPr>
-                <w:b w:val="0"/>
-                <w:sz w:val="14"/>
-              </w:rPr>
-              <w:t>32356.7</w:t>
+            <w:tcW w:type="dxa" w:w="753"/>
+            <w:noWrap/>
+            <w:vAlign w:val="center"/>
+          </w:tcPr>
+          <w:p>
+            <w:pPr>
+              <w:spacing w:before="0" w:after="0" w:line="240" w:lineRule="auto"/>
+              <w:jc w:val="center"/>
+              <w:rPr>
+                <w:sz w:val="14"/>
+                <w:szCs w:val="14"/>
+              </w:rPr>
+            </w:pPr>
+            <w:r>
+              <w:rPr>
+                <w:b w:val="0"/>
+                <w:sz w:val="14"/>
+              </w:rPr>
+              <w:t>32594.8</w:t>
             </w:r>
           </w:p>
         </w:tc>
@@ -13706,7 +13706,7 @@
                 <w:b w:val="0"/>
                 <w:sz w:val="14"/>
               </w:rPr>
-              <w:t>182858.0</w:t>
+              <w:t>183584.9</w:t>
             </w:r>
           </w:p>
         </w:tc>
@@ -13778,7 +13778,7 @@
                 <w:b w:val="0"/>
                 <w:sz w:val="14"/>
               </w:rPr>
-              <w:t>3264.6</w:t>
+              <w:t>3262.4</w:t>
             </w:r>
           </w:p>
         </w:tc>
@@ -14020,7 +14020,7 @@
                 <w:b w:val="0"/>
                 <w:sz w:val="14"/>
               </w:rPr>
-              <w:t>1976.0</w:t>
+              <w:t>1937.8</w:t>
             </w:r>
           </w:p>
         </w:tc>
@@ -14098,25 +14098,25 @@
         </w:tc>
         <w:tc>
           <w:tcPr>
-            <w:tcW w:type="dxa" w:w="756"/>
-            <w:noWrap/>
-            <w:vAlign w:val="center"/>
-          </w:tcPr>
-          <w:p>
-            <w:pPr>
-              <w:spacing w:before="0" w:after="0" w:line="240" w:lineRule="auto"/>
-              <w:jc w:val="center"/>
-              <w:rPr>
-                <w:sz w:val="14"/>
-                <w:szCs w:val="14"/>
-              </w:rPr>
-            </w:pPr>
-            <w:r>
-              <w:rPr>
-                <w:b w:val="0"/>
-                <w:sz w:val="14"/>
-              </w:rPr>
-              <w:t>31413.1</w:t>
+            <w:tcW w:type="dxa" w:w="753"/>
+            <w:noWrap/>
+            <w:vAlign w:val="center"/>
+          </w:tcPr>
+          <w:p>
+            <w:pPr>
+              <w:spacing w:before="0" w:after="0" w:line="240" w:lineRule="auto"/>
+              <w:jc w:val="center"/>
+              <w:rPr>
+                <w:sz w:val="14"/>
+                <w:szCs w:val="14"/>
+              </w:rPr>
+            </w:pPr>
+            <w:r>
+              <w:rPr>
+                <w:b w:val="0"/>
+                <w:sz w:val="14"/>
+              </w:rPr>
+              <w:t>31655.6</w:t>
             </w:r>
           </w:p>
         </w:tc>
@@ -14140,7 +14140,7 @@
                 <w:b w:val="0"/>
                 <w:sz w:val="14"/>
               </w:rPr>
-              <w:t>179593.4</w:t>
+              <w:t>180322.4</w:t>
             </w:r>
           </w:p>
         </w:tc>
@@ -14212,7 +14212,7 @@
                 <w:b w:val="0"/>
                 <w:sz w:val="14"/>
               </w:rPr>
-              <w:t>4662.9</w:t>
+              <w:t>4665.3</w:t>
             </w:r>
           </w:p>
         </w:tc>
@@ -14454,7 +14454,7 @@
                 <w:b w:val="0"/>
                 <w:sz w:val="14"/>
               </w:rPr>
-              <w:t>2013.7</w:t>
+              <w:t>1974.5</w:t>
             </w:r>
           </w:p>
         </w:tc>
@@ -14532,25 +14532,25 @@
         </w:tc>
         <w:tc>
           <w:tcPr>
-            <w:tcW w:type="dxa" w:w="756"/>
-            <w:noWrap/>
-            <w:vAlign w:val="center"/>
-          </w:tcPr>
-          <w:p>
-            <w:pPr>
-              <w:spacing w:before="0" w:after="0" w:line="240" w:lineRule="auto"/>
-              <w:jc w:val="center"/>
-              <w:rPr>
-                <w:sz w:val="14"/>
-                <w:szCs w:val="14"/>
-              </w:rPr>
-            </w:pPr>
-            <w:r>
-              <w:rPr>
-                <w:b w:val="0"/>
-                <w:sz w:val="14"/>
-              </w:rPr>
-              <w:t>30401.9</w:t>
+            <w:tcW w:type="dxa" w:w="753"/>
+            <w:noWrap/>
+            <w:vAlign w:val="center"/>
+          </w:tcPr>
+          <w:p>
+            <w:pPr>
+              <w:spacing w:before="0" w:after="0" w:line="240" w:lineRule="auto"/>
+              <w:jc w:val="center"/>
+              <w:rPr>
+                <w:sz w:val="14"/>
+                <w:szCs w:val="14"/>
+              </w:rPr>
+            </w:pPr>
+            <w:r>
+              <w:rPr>
+                <w:b w:val="0"/>
+                <w:sz w:val="14"/>
+              </w:rPr>
+              <w:t>30650.0</w:t>
             </w:r>
           </w:p>
         </w:tc>
@@ -14574,7 +14574,7 @@
                 <w:b w:val="0"/>
                 <w:sz w:val="14"/>
               </w:rPr>
-              <w:t>174930.5</w:t>
+              <w:t>175657.1</w:t>
             </w:r>
           </w:p>
         </w:tc>
@@ -14646,7 +14646,7 @@
                 <w:b w:val="0"/>
                 <w:sz w:val="14"/>
               </w:rPr>
-              <w:t>5989.5</w:t>
+              <w:t>5997.3</w:t>
             </w:r>
           </w:p>
         </w:tc>
@@ -14888,7 +14888,7 @@
                 <w:b w:val="0"/>
                 <w:sz w:val="14"/>
               </w:rPr>
-              <w:t>2036.1</w:t>
+              <w:t>1995.8</w:t>
             </w:r>
           </w:p>
         </w:tc>
@@ -14966,25 +14966,25 @@
         </w:tc>
         <w:tc>
           <w:tcPr>
-            <w:tcW w:type="dxa" w:w="756"/>
-            <w:noWrap/>
-            <w:vAlign w:val="center"/>
-          </w:tcPr>
-          <w:p>
-            <w:pPr>
-              <w:spacing w:before="0" w:after="0" w:line="240" w:lineRule="auto"/>
-              <w:jc w:val="center"/>
-              <w:rPr>
-                <w:sz w:val="14"/>
-                <w:szCs w:val="14"/>
-              </w:rPr>
-            </w:pPr>
-            <w:r>
-              <w:rPr>
-                <w:b w:val="0"/>
-                <w:sz w:val="14"/>
-              </w:rPr>
-              <w:t>29312.7</w:t>
+            <w:tcW w:type="dxa" w:w="753"/>
+            <w:noWrap/>
+            <w:vAlign w:val="center"/>
+          </w:tcPr>
+          <w:p>
+            <w:pPr>
+              <w:spacing w:before="0" w:after="0" w:line="240" w:lineRule="auto"/>
+              <w:jc w:val="center"/>
+              <w:rPr>
+                <w:sz w:val="14"/>
+                <w:szCs w:val="14"/>
+              </w:rPr>
+            </w:pPr>
+            <w:r>
+              <w:rPr>
+                <w:b w:val="0"/>
+                <w:sz w:val="14"/>
+              </w:rPr>
+              <w:t>29567.5</w:t>
             </w:r>
           </w:p>
         </w:tc>
@@ -15008,7 +15008,7 @@
                 <w:b w:val="0"/>
                 <w:sz w:val="14"/>
               </w:rPr>
-              <w:t>168941.0</w:t>
+              <w:t>169659.8</w:t>
             </w:r>
           </w:p>
         </w:tc>
@@ -15080,7 +15080,7 @@
                 <w:b w:val="0"/>
                 <w:sz w:val="14"/>
               </w:rPr>
-              <w:t>7225.7</w:t>
+              <w:t>7239.7</w:t>
             </w:r>
           </w:p>
         </w:tc>
@@ -15322,7 +15322,7 @@
                 <w:b w:val="0"/>
                 <w:sz w:val="14"/>
               </w:rPr>
-              <w:t>2043.7</w:t>
+              <w:t>2002.3</w:t>
             </w:r>
           </w:p>
         </w:tc>
@@ -15400,25 +15400,25 @@
         </w:tc>
         <w:tc>
           <w:tcPr>
-            <w:tcW w:type="dxa" w:w="756"/>
-            <w:noWrap/>
-            <w:vAlign w:val="center"/>
-          </w:tcPr>
-          <w:p>
-            <w:pPr>
-              <w:spacing w:before="0" w:after="0" w:line="240" w:lineRule="auto"/>
-              <w:jc w:val="center"/>
-              <w:rPr>
-                <w:sz w:val="14"/>
-                <w:szCs w:val="14"/>
-              </w:rPr>
-            </w:pPr>
-            <w:r>
-              <w:rPr>
-                <w:b w:val="0"/>
-                <w:sz w:val="14"/>
-              </w:rPr>
-              <w:t>28133.8</w:t>
+            <w:tcW w:type="dxa" w:w="753"/>
+            <w:noWrap/>
+            <w:vAlign w:val="center"/>
+          </w:tcPr>
+          <w:p>
+            <w:pPr>
+              <w:spacing w:before="0" w:after="0" w:line="240" w:lineRule="auto"/>
+              <w:jc w:val="center"/>
+              <w:rPr>
+                <w:sz w:val="14"/>
+                <w:szCs w:val="14"/>
+              </w:rPr>
+            </w:pPr>
+            <w:r>
+              <w:rPr>
+                <w:b w:val="0"/>
+                <w:sz w:val="14"/>
+              </w:rPr>
+              <w:t>28396.6</w:t>
             </w:r>
           </w:p>
         </w:tc>
@@ -15442,7 +15442,7 @@
                 <w:b w:val="0"/>
                 <w:sz w:val="14"/>
               </w:rPr>
-              <w:t>161715.3</w:t>
+              <w:t>162420.1</w:t>
             </w:r>
           </w:p>
         </w:tc>
@@ -15514,7 +15514,7 @@
                 <w:b w:val="0"/>
                 <w:sz w:val="14"/>
               </w:rPr>
-              <w:t>8352.2</w:t>
+              <w:t>8373.1</w:t>
             </w:r>
           </w:p>
         </w:tc>
@@ -15756,7 +15756,7 @@
                 <w:b w:val="0"/>
                 <w:sz w:val="14"/>
               </w:rPr>
-              <w:t>2036.8</w:t>
+              <w:t>1994.2</w:t>
             </w:r>
           </w:p>
         </w:tc>
@@ -15834,25 +15834,25 @@
         </w:tc>
         <w:tc>
           <w:tcPr>
-            <w:tcW w:type="dxa" w:w="756"/>
-            <w:noWrap/>
-            <w:vAlign w:val="center"/>
-          </w:tcPr>
-          <w:p>
-            <w:pPr>
-              <w:spacing w:before="0" w:after="0" w:line="240" w:lineRule="auto"/>
-              <w:jc w:val="center"/>
-              <w:rPr>
-                <w:sz w:val="14"/>
-                <w:szCs w:val="14"/>
-              </w:rPr>
-            </w:pPr>
-            <w:r>
-              <w:rPr>
-                <w:b w:val="0"/>
-                <w:sz w:val="14"/>
-              </w:rPr>
-              <w:t>26852.9</w:t>
+            <w:tcW w:type="dxa" w:w="753"/>
+            <w:noWrap/>
+            <w:vAlign w:val="center"/>
+          </w:tcPr>
+          <w:p>
+            <w:pPr>
+              <w:spacing w:before="0" w:after="0" w:line="240" w:lineRule="auto"/>
+              <w:jc w:val="center"/>
+              <w:rPr>
+                <w:sz w:val="14"/>
+                <w:szCs w:val="14"/>
+              </w:rPr>
+            </w:pPr>
+            <w:r>
+              <w:rPr>
+                <w:b w:val="0"/>
+                <w:sz w:val="14"/>
+              </w:rPr>
+              <w:t>27124.8</w:t>
             </w:r>
           </w:p>
         </w:tc>
@@ -15876,7 +15876,7 @@
                 <w:b w:val="0"/>
                 <w:sz w:val="14"/>
               </w:rPr>
-              <w:t>153363.2</w:t>
+              <w:t>154047.1</w:t>
             </w:r>
           </w:p>
         </w:tc>
@@ -15948,7 +15948,7 @@
                 <w:b w:val="0"/>
                 <w:sz w:val="14"/>
               </w:rPr>
-              <w:t>9348.1</w:t>
+              <w:t>9376.9</w:t>
             </w:r>
           </w:p>
         </w:tc>
@@ -16190,7 +16190,7 @@
                 <w:b w:val="0"/>
                 <w:sz w:val="14"/>
               </w:rPr>
-              <w:t>2015.5</w:t>
+              <w:t>1971.8</w:t>
             </w:r>
           </w:p>
         </w:tc>
@@ -16268,25 +16268,25 @@
         </w:tc>
         <w:tc>
           <w:tcPr>
-            <w:tcW w:type="dxa" w:w="756"/>
-            <w:noWrap/>
-            <w:vAlign w:val="center"/>
-          </w:tcPr>
-          <w:p>
-            <w:pPr>
-              <w:spacing w:before="0" w:after="0" w:line="240" w:lineRule="auto"/>
-              <w:jc w:val="center"/>
-              <w:rPr>
-                <w:sz w:val="14"/>
-                <w:szCs w:val="14"/>
-              </w:rPr>
-            </w:pPr>
-            <w:r>
-              <w:rPr>
-                <w:b w:val="0"/>
-                <w:sz w:val="14"/>
-              </w:rPr>
-              <w:t>25456.4</w:t>
+            <w:tcW w:type="dxa" w:w="753"/>
+            <w:noWrap/>
+            <w:vAlign w:val="center"/>
+          </w:tcPr>
+          <w:p>
+            <w:pPr>
+              <w:spacing w:before="0" w:after="0" w:line="240" w:lineRule="auto"/>
+              <w:jc w:val="center"/>
+              <w:rPr>
+                <w:sz w:val="14"/>
+                <w:szCs w:val="14"/>
+              </w:rPr>
+            </w:pPr>
+            <w:r>
+              <w:rPr>
+                <w:b w:val="0"/>
+                <w:sz w:val="14"/>
+              </w:rPr>
+              <w:t>25738.6</w:t>
             </w:r>
           </w:p>
         </w:tc>
@@ -16310,7 +16310,7 @@
                 <w:b w:val="0"/>
                 <w:sz w:val="14"/>
               </w:rPr>
-              <w:t>144015.1</w:t>
+              <w:t>144670.2</w:t>
             </w:r>
           </w:p>
         </w:tc>
@@ -16382,7 +16382,7 @@
                 <w:b w:val="0"/>
                 <w:sz w:val="14"/>
               </w:rPr>
-              <w:t>10191.1</w:t>
+              <w:t>10228.8</w:t>
             </w:r>
           </w:p>
         </w:tc>
@@ -16624,7 +16624,7 @@
                 <w:b w:val="0"/>
                 <w:sz w:val="14"/>
               </w:rPr>
-              <w:t>1979.9</w:t>
+              <w:t>1935.0</w:t>
             </w:r>
           </w:p>
         </w:tc>
@@ -16702,25 +16702,25 @@
         </w:tc>
         <w:tc>
           <w:tcPr>
-            <w:tcW w:type="dxa" w:w="756"/>
-            <w:noWrap/>
-            <w:vAlign w:val="center"/>
-          </w:tcPr>
-          <w:p>
-            <w:pPr>
-              <w:spacing w:before="0" w:after="0" w:line="240" w:lineRule="auto"/>
-              <w:jc w:val="center"/>
-              <w:rPr>
-                <w:sz w:val="14"/>
-                <w:szCs w:val="14"/>
-              </w:rPr>
-            </w:pPr>
-            <w:r>
-              <w:rPr>
-                <w:b w:val="0"/>
-                <w:sz w:val="14"/>
-              </w:rPr>
-              <w:t>23929.1</w:t>
+            <w:tcW w:type="dxa" w:w="753"/>
+            <w:noWrap/>
+            <w:vAlign w:val="center"/>
+          </w:tcPr>
+          <w:p>
+            <w:pPr>
+              <w:spacing w:before="0" w:after="0" w:line="240" w:lineRule="auto"/>
+              <w:jc w:val="center"/>
+              <w:rPr>
+                <w:sz w:val="14"/>
+                <w:szCs w:val="14"/>
+              </w:rPr>
+            </w:pPr>
+            <w:r>
+              <w:rPr>
+                <w:b w:val="0"/>
+                <w:sz w:val="14"/>
+              </w:rPr>
+              <w:t>24222.9</w:t>
             </w:r>
           </w:p>
         </w:tc>
@@ -16744,7 +16744,7 @@
                 <w:b w:val="0"/>
                 <w:sz w:val="14"/>
               </w:rPr>
-              <w:t>133824.0</w:t>
+              <w:t>134441.4</w:t>
             </w:r>
           </w:p>
         </w:tc>
@@ -16816,7 +16816,7 @@
                 <w:b w:val="0"/>
                 <w:sz w:val="14"/>
               </w:rPr>
-              <w:t>10856.9</w:t>
+              <w:t>10904.6</w:t>
             </w:r>
           </w:p>
         </w:tc>
@@ -17058,7 +17058,7 @@
                 <w:b w:val="0"/>
                 <w:sz w:val="14"/>
               </w:rPr>
-              <w:t>1929.8</w:t>
+              <w:t>1883.7</w:t>
             </w:r>
           </w:p>
         </w:tc>
@@ -17136,25 +17136,25 @@
         </w:tc>
         <w:tc>
           <w:tcPr>
-            <w:tcW w:type="dxa" w:w="756"/>
-            <w:noWrap/>
-            <w:vAlign w:val="center"/>
-          </w:tcPr>
-          <w:p>
-            <w:pPr>
-              <w:spacing w:before="0" w:after="0" w:line="240" w:lineRule="auto"/>
-              <w:jc w:val="center"/>
-              <w:rPr>
-                <w:sz w:val="14"/>
-                <w:szCs w:val="14"/>
-              </w:rPr>
-            </w:pPr>
-            <w:r>
-              <w:rPr>
-                <w:b w:val="0"/>
-                <w:sz w:val="14"/>
-              </w:rPr>
-              <w:t>22254.3</w:t>
+            <w:tcW w:type="dxa" w:w="753"/>
+            <w:noWrap/>
+            <w:vAlign w:val="center"/>
+          </w:tcPr>
+          <w:p>
+            <w:pPr>
+              <w:spacing w:before="0" w:after="0" w:line="240" w:lineRule="auto"/>
+              <w:jc w:val="center"/>
+              <w:rPr>
+                <w:sz w:val="14"/>
+                <w:szCs w:val="14"/>
+              </w:rPr>
+            </w:pPr>
+            <w:r>
+              <w:rPr>
+                <w:b w:val="0"/>
+                <w:sz w:val="14"/>
+              </w:rPr>
+              <w:t>22560.6</w:t>
             </w:r>
           </w:p>
         </w:tc>
@@ -17178,7 +17178,7 @@
                 <w:b w:val="0"/>
                 <w:sz w:val="14"/>
               </w:rPr>
-              <w:t>122967.1</w:t>
+              <w:t>123536.8</w:t>
             </w:r>
           </w:p>
         </w:tc>
@@ -17250,7 +17250,7 @@
                 <w:b w:val="0"/>
                 <w:sz w:val="14"/>
               </w:rPr>
-              <w:t>11318.1</w:t>
+              <w:t>11376.9</w:t>
             </w:r>
           </w:p>
         </w:tc>
@@ -17492,7 +17492,7 @@
                 <w:b w:val="0"/>
                 <w:sz w:val="14"/>
               </w:rPr>
-              <w:t>1864.7</w:t>
+              <w:t>1817.7</w:t>
             </w:r>
           </w:p>
         </w:tc>
@@ -17570,25 +17570,25 @@
         </w:tc>
         <w:tc>
           <w:tcPr>
-            <w:tcW w:type="dxa" w:w="756"/>
-            <w:noWrap/>
-            <w:vAlign w:val="center"/>
-          </w:tcPr>
-          <w:p>
-            <w:pPr>
-              <w:spacing w:before="0" w:after="0" w:line="240" w:lineRule="auto"/>
-              <w:jc w:val="center"/>
-              <w:rPr>
-                <w:sz w:val="14"/>
-                <w:szCs w:val="14"/>
-              </w:rPr>
-            </w:pPr>
-            <w:r>
-              <w:rPr>
-                <w:b w:val="0"/>
-                <w:sz w:val="14"/>
-              </w:rPr>
-              <w:t>20413.0</w:t>
+            <w:tcW w:type="dxa" w:w="753"/>
+            <w:noWrap/>
+            <w:vAlign w:val="center"/>
+          </w:tcPr>
+          <w:p>
+            <w:pPr>
+              <w:spacing w:before="0" w:after="0" w:line="240" w:lineRule="auto"/>
+              <w:jc w:val="center"/>
+              <w:rPr>
+                <w:sz w:val="14"/>
+                <w:szCs w:val="14"/>
+              </w:rPr>
+            </w:pPr>
+            <w:r>
+              <w:rPr>
+                <w:b w:val="0"/>
+                <w:sz w:val="14"/>
+              </w:rPr>
+              <w:t>20731.7</w:t>
             </w:r>
           </w:p>
         </w:tc>
@@ -17612,7 +17612,7 @@
                 <w:b w:val="0"/>
                 <w:sz w:val="14"/>
               </w:rPr>
-              <w:t>111649.0</w:t>
+              <w:t>112159.8</w:t>
             </w:r>
           </w:p>
         </w:tc>
@@ -17684,7 +17684,7 @@
                 <w:b w:val="0"/>
                 <w:sz w:val="14"/>
               </w:rPr>
-              <w:t>11544.3</w:t>
+              <w:t>11615.0</w:t>
             </w:r>
           </w:p>
         </w:tc>
@@ -17926,7 +17926,7 @@
                 <w:b w:val="0"/>
                 <w:sz w:val="14"/>
               </w:rPr>
-              <w:t>1784.2</w:t>
+              <w:t>1736.7</w:t>
             </w:r>
           </w:p>
         </w:tc>
@@ -18004,25 +18004,25 @@
         </w:tc>
         <w:tc>
           <w:tcPr>
-            <w:tcW w:type="dxa" w:w="756"/>
-            <w:noWrap/>
-            <w:vAlign w:val="center"/>
-          </w:tcPr>
-          <w:p>
-            <w:pPr>
-              <w:spacing w:before="0" w:after="0" w:line="240" w:lineRule="auto"/>
-              <w:jc w:val="center"/>
-              <w:rPr>
-                <w:sz w:val="14"/>
-                <w:szCs w:val="14"/>
-              </w:rPr>
-            </w:pPr>
-            <w:r>
-              <w:rPr>
-                <w:b w:val="0"/>
-                <w:sz w:val="14"/>
-              </w:rPr>
-              <w:t>18383.0</w:t>
+            <w:tcW w:type="dxa" w:w="753"/>
+            <w:noWrap/>
+            <w:vAlign w:val="center"/>
+          </w:tcPr>
+          <w:p>
+            <w:pPr>
+              <w:spacing w:before="0" w:after="0" w:line="240" w:lineRule="auto"/>
+              <w:jc w:val="center"/>
+              <w:rPr>
+                <w:sz w:val="14"/>
+                <w:szCs w:val="14"/>
+              </w:rPr>
+            </w:pPr>
+            <w:r>
+              <w:rPr>
+                <w:b w:val="0"/>
+                <w:sz w:val="14"/>
+              </w:rPr>
+              <w:t>18712.0</w:t>
             </w:r>
           </w:p>
         </w:tc>
@@ -18046,7 +18046,7 @@
                 <w:b w:val="0"/>
                 <w:sz w:val="14"/>
               </w:rPr>
-              <w:t>100104.7</w:t>
+              <w:t>100544.8</w:t>
             </w:r>
           </w:p>
         </w:tc>
@@ -18118,7 +18118,7 @@
                 <w:b w:val="0"/>
                 <w:sz w:val="14"/>
               </w:rPr>
-              <w:t>11500.3</w:t>
+              <w:t>11583.0</w:t>
             </w:r>
           </w:p>
         </w:tc>
@@ -18360,7 +18360,7 @@
                 <w:b w:val="0"/>
                 <w:sz w:val="14"/>
               </w:rPr>
-              <w:t>1687.5</w:t>
+              <w:t>1640.7</w:t>
             </w:r>
           </w:p>
         </w:tc>
@@ -18438,25 +18438,25 @@
         </w:tc>
         <w:tc>
           <w:tcPr>
-            <w:tcW w:type="dxa" w:w="756"/>
-            <w:noWrap/>
-            <w:vAlign w:val="center"/>
-          </w:tcPr>
-          <w:p>
-            <w:pPr>
-              <w:spacing w:before="0" w:after="0" w:line="240" w:lineRule="auto"/>
-              <w:jc w:val="center"/>
-              <w:rPr>
-                <w:sz w:val="14"/>
-                <w:szCs w:val="14"/>
-              </w:rPr>
-            </w:pPr>
-            <w:r>
-              <w:rPr>
-                <w:b w:val="0"/>
-                <w:sz w:val="14"/>
-              </w:rPr>
-              <w:t>16138.4</w:t>
+            <w:tcW w:type="dxa" w:w="753"/>
+            <w:noWrap/>
+            <w:vAlign w:val="center"/>
+          </w:tcPr>
+          <w:p>
+            <w:pPr>
+              <w:spacing w:before="0" w:after="0" w:line="240" w:lineRule="auto"/>
+              <w:jc w:val="center"/>
+              <w:rPr>
+                <w:sz w:val="14"/>
+                <w:szCs w:val="14"/>
+              </w:rPr>
+            </w:pPr>
+            <w:r>
+              <w:rPr>
+                <w:b w:val="0"/>
+                <w:sz w:val="14"/>
+              </w:rPr>
+              <w:t>16471.3</w:t>
             </w:r>
           </w:p>
         </w:tc>
@@ -18480,7 +18480,7 @@
                 <w:b w:val="0"/>
                 <w:sz w:val="14"/>
               </w:rPr>
-              <w:t>88604.4</w:t>
+              <w:t>88961.8</w:t>
             </w:r>
           </w:p>
         </w:tc>
@@ -18552,7 +18552,7 @@
                 <w:b w:val="0"/>
                 <w:sz w:val="14"/>
               </w:rPr>
-              <w:t>11145.6</w:t>
+              <w:t>11238.4</w:t>
             </w:r>
           </w:p>
         </w:tc>
@@ -18794,7 +18794,7 @@
                 <w:b w:val="0"/>
                 <w:sz w:val="14"/>
               </w:rPr>
-              <w:t>1573.9</w:t>
+              <w:t>1529.5</w:t>
             </w:r>
           </w:p>
         </w:tc>
@@ -18872,25 +18872,25 @@
         </w:tc>
         <w:tc>
           <w:tcPr>
-            <w:tcW w:type="dxa" w:w="756"/>
-            <w:noWrap/>
-            <w:vAlign w:val="center"/>
-          </w:tcPr>
-          <w:p>
-            <w:pPr>
-              <w:spacing w:before="0" w:after="0" w:line="240" w:lineRule="auto"/>
-              <w:jc w:val="center"/>
-              <w:rPr>
-                <w:sz w:val="14"/>
-                <w:szCs w:val="14"/>
-              </w:rPr>
-            </w:pPr>
-            <w:r>
-              <w:rPr>
-                <w:b w:val="0"/>
-                <w:sz w:val="14"/>
-              </w:rPr>
-              <w:t>13646.9</w:t>
+            <w:tcW w:type="dxa" w:w="753"/>
+            <w:noWrap/>
+            <w:vAlign w:val="center"/>
+          </w:tcPr>
+          <w:p>
+            <w:pPr>
+              <w:spacing w:before="0" w:after="0" w:line="240" w:lineRule="auto"/>
+              <w:jc w:val="center"/>
+              <w:rPr>
+                <w:sz w:val="14"/>
+                <w:szCs w:val="14"/>
+              </w:rPr>
+            </w:pPr>
+            <w:r>
+              <w:rPr>
+                <w:b w:val="0"/>
+                <w:sz w:val="14"/>
+              </w:rPr>
+              <w:t>13970.7</w:t>
             </w:r>
           </w:p>
         </w:tc>
@@ -18914,7 +18914,7 @@
                 <w:b w:val="0"/>
                 <w:sz w:val="14"/>
               </w:rPr>
-              <w:t>77458.8</w:t>
+              <w:t>77723.4</w:t>
             </w:r>
           </w:p>
         </w:tc>
@@ -18986,7 +18986,7 @@
                 <w:b w:val="0"/>
                 <w:sz w:val="14"/>
               </w:rPr>
-              <w:t>10431.7</w:t>
+              <w:t>10530.1</w:t>
             </w:r>
           </w:p>
         </w:tc>
@@ -19228,7 +19228,7 @@
                 <w:b w:val="0"/>
                 <w:sz w:val="14"/>
               </w:rPr>
-              <w:t>1443.4</w:t>
+              <w:t>1404.3</w:t>
             </w:r>
           </w:p>
         </w:tc>
@@ -19306,25 +19306,25 @@
         </w:tc>
         <w:tc>
           <w:tcPr>
-            <w:tcW w:type="dxa" w:w="756"/>
-            <w:noWrap/>
-            <w:vAlign w:val="center"/>
-          </w:tcPr>
-          <w:p>
-            <w:pPr>
-              <w:spacing w:before="0" w:after="0" w:line="240" w:lineRule="auto"/>
-              <w:jc w:val="center"/>
-              <w:rPr>
-                <w:sz w:val="14"/>
-                <w:szCs w:val="14"/>
-              </w:rPr>
-            </w:pPr>
-            <w:r>
-              <w:rPr>
-                <w:b w:val="0"/>
-                <w:sz w:val="14"/>
-              </w:rPr>
-              <w:t>10860.1</w:t>
+            <w:tcW w:type="dxa" w:w="753"/>
+            <w:noWrap/>
+            <w:vAlign w:val="center"/>
+          </w:tcPr>
+          <w:p>
+            <w:pPr>
+              <w:spacing w:before="0" w:after="0" w:line="240" w:lineRule="auto"/>
+              <w:jc w:val="center"/>
+              <w:rPr>
+                <w:sz w:val="14"/>
+                <w:szCs w:val="14"/>
+              </w:rPr>
+            </w:pPr>
+            <w:r>
+              <w:rPr>
+                <w:b w:val="0"/>
+                <w:sz w:val="14"/>
+              </w:rPr>
+              <w:t>11153.8</w:t>
             </w:r>
           </w:p>
         </w:tc>
@@ -19348,7 +19348,7 @@
                 <w:b w:val="0"/>
                 <w:sz w:val="14"/>
               </w:rPr>
-              <w:t>67027.1</w:t>
+              <w:t>67193.3</w:t>
             </w:r>
           </w:p>
         </w:tc>
@@ -19420,7 +19420,7 @@
                 <w:b w:val="0"/>
                 <w:sz w:val="14"/>
               </w:rPr>
-              <w:t>9296.8</w:t>
+              <w:t>9392.2</w:t>
             </w:r>
           </w:p>
         </w:tc>
@@ -19662,7 +19662,7 @@
                 <w:b w:val="0"/>
                 <w:sz w:val="14"/>
               </w:rPr>
-              <w:t>1301.3</w:t>
+              <w:t>1269.9</w:t>
             </w:r>
           </w:p>
         </w:tc>
@@ -19740,25 +19740,25 @@
         </w:tc>
         <w:tc>
           <w:tcPr>
-            <w:tcW w:type="dxa" w:w="756"/>
-            <w:noWrap/>
-            <w:vAlign w:val="center"/>
-          </w:tcPr>
-          <w:p>
-            <w:pPr>
-              <w:spacing w:before="0" w:after="0" w:line="240" w:lineRule="auto"/>
-              <w:jc w:val="center"/>
-              <w:rPr>
-                <w:sz w:val="14"/>
-                <w:szCs w:val="14"/>
-              </w:rPr>
-            </w:pPr>
-            <w:r>
-              <w:rPr>
-                <w:b w:val="0"/>
-                <w:sz w:val="14"/>
-              </w:rPr>
-              <w:t>9089.7</w:t>
+            <w:tcW w:type="dxa" w:w="753"/>
+            <w:noWrap/>
+            <w:vAlign w:val="center"/>
+          </w:tcPr>
+          <w:p>
+            <w:pPr>
+              <w:spacing w:before="0" w:after="0" w:line="240" w:lineRule="auto"/>
+              <w:jc w:val="center"/>
+              <w:rPr>
+                <w:sz w:val="14"/>
+                <w:szCs w:val="14"/>
+              </w:rPr>
+            </w:pPr>
+            <w:r>
+              <w:rPr>
+                <w:b w:val="0"/>
+                <w:sz w:val="14"/>
+              </w:rPr>
+              <w:t>9322.3</w:t>
             </w:r>
           </w:p>
         </w:tc>
@@ -19782,7 +19782,7 @@
                 <w:b w:val="0"/>
                 <w:sz w:val="14"/>
               </w:rPr>
-              <w:t>57730.4</w:t>
+              <w:t>57801.1</w:t>
             </w:r>
           </w:p>
         </w:tc>
@@ -19854,7 +19854,7 @@
                 <w:b w:val="0"/>
                 <w:sz w:val="14"/>
               </w:rPr>
-              <w:t>8486.5</w:t>
+              <w:t>8561.3</w:t>
             </w:r>
           </w:p>
         </w:tc>
@@ -20096,7 +20096,7 @@
                 <w:b w:val="0"/>
                 <w:sz w:val="14"/>
               </w:rPr>
-              <w:t>1152.8</w:t>
+              <w:t>1129.7</w:t>
             </w:r>
           </w:p>
         </w:tc>
@@ -20174,25 +20174,25 @@
         </w:tc>
         <w:tc>
           <w:tcPr>
-            <w:tcW w:type="dxa" w:w="756"/>
-            <w:noWrap/>
-            <w:vAlign w:val="center"/>
-          </w:tcPr>
-          <w:p>
-            <w:pPr>
-              <w:spacing w:before="0" w:after="0" w:line="240" w:lineRule="auto"/>
-              <w:jc w:val="center"/>
-              <w:rPr>
-                <w:sz w:val="14"/>
-                <w:szCs w:val="14"/>
-              </w:rPr>
-            </w:pPr>
-            <w:r>
-              <w:rPr>
-                <w:b w:val="0"/>
-                <w:sz w:val="14"/>
-              </w:rPr>
-              <w:t>9081.2</w:t>
+            <w:tcW w:type="dxa" w:w="753"/>
+            <w:noWrap/>
+            <w:vAlign w:val="center"/>
+          </w:tcPr>
+          <w:p>
+            <w:pPr>
+              <w:spacing w:before="0" w:after="0" w:line="240" w:lineRule="auto"/>
+              <w:jc w:val="center"/>
+              <w:rPr>
+                <w:sz w:val="14"/>
+                <w:szCs w:val="14"/>
+              </w:rPr>
+            </w:pPr>
+            <w:r>
+              <w:rPr>
+                <w:b w:val="0"/>
+                <w:sz w:val="14"/>
+              </w:rPr>
+              <w:t>9250.6</w:t>
             </w:r>
           </w:p>
         </w:tc>
@@ -20216,7 +20216,7 @@
                 <w:b w:val="0"/>
                 <w:sz w:val="14"/>
               </w:rPr>
-              <w:t>49243.9</w:t>
+              <w:t>49239.8</w:t>
             </w:r>
           </w:p>
         </w:tc>
@@ -20288,7 +20288,7 @@
                 <w:b w:val="0"/>
                 <w:sz w:val="14"/>
               </w:rPr>
-              <w:t>8783.7</w:t>
+              <w:t>8829.9</w:t>
             </w:r>
           </w:p>
         </w:tc>
@@ -20530,7 +20530,7 @@
                 <w:b w:val="0"/>
                 <w:sz w:val="14"/>
               </w:rPr>
-              <w:t>999.4</w:t>
+              <w:t>983.3</w:t>
             </w:r>
           </w:p>
         </w:tc>
@@ -20608,25 +20608,25 @@
         </w:tc>
         <w:tc>
           <w:tcPr>
-            <w:tcW w:type="dxa" w:w="756"/>
-            <w:noWrap/>
-            <w:vAlign w:val="center"/>
-          </w:tcPr>
-          <w:p>
-            <w:pPr>
-              <w:spacing w:before="0" w:after="0" w:line="240" w:lineRule="auto"/>
-              <w:jc w:val="center"/>
-              <w:rPr>
-                <w:sz w:val="14"/>
-                <w:szCs w:val="14"/>
-              </w:rPr>
-            </w:pPr>
-            <w:r>
-              <w:rPr>
-                <w:b w:val="0"/>
-                <w:sz w:val="14"/>
-              </w:rPr>
-              <w:t>8841.0</w:t>
+            <w:tcW w:type="dxa" w:w="753"/>
+            <w:noWrap/>
+            <w:vAlign w:val="center"/>
+          </w:tcPr>
+          <w:p>
+            <w:pPr>
+              <w:spacing w:before="0" w:after="0" w:line="240" w:lineRule="auto"/>
+              <w:jc w:val="center"/>
+              <w:rPr>
+                <w:sz w:val="14"/>
+                <w:szCs w:val="14"/>
+              </w:rPr>
+            </w:pPr>
+            <w:r>
+              <w:rPr>
+                <w:b w:val="0"/>
+                <w:sz w:val="14"/>
+              </w:rPr>
+              <w:t>8954.9</w:t>
             </w:r>
           </w:p>
         </w:tc>
@@ -20650,7 +20650,7 @@
                 <w:b w:val="0"/>
                 <w:sz w:val="14"/>
               </w:rPr>
-              <w:t>40460.2</w:t>
+              <w:t>40410.0</w:t>
             </w:r>
           </w:p>
         </w:tc>
@@ -20722,7 +20722,7 @@
                 <w:b w:val="0"/>
                 <w:sz w:val="14"/>
               </w:rPr>
-              <w:t>8839.6</w:t>
+              <w:t>8860.6</w:t>
             </w:r>
           </w:p>
         </w:tc>
@@ -20964,7 +20964,7 @@
                 <w:b w:val="0"/>
                 <w:sz w:val="14"/>
               </w:rPr>
-              <w:t>840.3</w:t>
+              <w:t>829.6</w:t>
             </w:r>
           </w:p>
         </w:tc>
@@ -21042,25 +21042,25 @@
         </w:tc>
         <w:tc>
           <w:tcPr>
-            <w:tcW w:type="dxa" w:w="756"/>
-            <w:noWrap/>
-            <w:vAlign w:val="center"/>
-          </w:tcPr>
-          <w:p>
-            <w:pPr>
-              <w:spacing w:before="0" w:after="0" w:line="240" w:lineRule="auto"/>
-              <w:jc w:val="center"/>
-              <w:rPr>
-                <w:sz w:val="14"/>
-                <w:szCs w:val="14"/>
-              </w:rPr>
-            </w:pPr>
-            <w:r>
-              <w:rPr>
-                <w:b w:val="0"/>
-                <w:sz w:val="14"/>
-              </w:rPr>
-              <w:t>8327.6</w:t>
+            <w:tcW w:type="dxa" w:w="753"/>
+            <w:noWrap/>
+            <w:vAlign w:val="center"/>
+          </w:tcPr>
+          <w:p>
+            <w:pPr>
+              <w:spacing w:before="0" w:after="0" w:line="240" w:lineRule="auto"/>
+              <w:jc w:val="center"/>
+              <w:rPr>
+                <w:sz w:val="14"/>
+                <w:szCs w:val="14"/>
+              </w:rPr>
+            </w:pPr>
+            <w:r>
+              <w:rPr>
+                <w:b w:val="0"/>
+                <w:sz w:val="14"/>
+              </w:rPr>
+              <w:t>8398.1</w:t>
             </w:r>
           </w:p>
         </w:tc>
@@ -21084,7 +21084,7 @@
                 <w:b w:val="0"/>
                 <w:sz w:val="14"/>
               </w:rPr>
-              <w:t>31620.6</w:t>
+              <w:t>31549.4</w:t>
             </w:r>
           </w:p>
         </w:tc>
@@ -21156,7 +21156,7 @@
                 <w:b w:val="0"/>
                 <w:sz w:val="14"/>
               </w:rPr>
-              <w:t>8596.1</w:t>
+              <w:t>8597.7</w:t>
             </w:r>
           </w:p>
         </w:tc>
@@ -21398,7 +21398,7 @@
                 <w:b w:val="0"/>
                 <w:sz w:val="14"/>
               </w:rPr>
-              <w:t>673.8</w:t>
+              <w:t>666.8</w:t>
             </w:r>
           </w:p>
         </w:tc>
@@ -21476,25 +21476,25 @@
         </w:tc>
         <w:tc>
           <w:tcPr>
-            <w:tcW w:type="dxa" w:w="756"/>
-            <w:noWrap/>
-            <w:vAlign w:val="center"/>
-          </w:tcPr>
-          <w:p>
-            <w:pPr>
-              <w:spacing w:before="0" w:after="0" w:line="240" w:lineRule="auto"/>
-              <w:jc w:val="center"/>
-              <w:rPr>
-                <w:sz w:val="14"/>
-                <w:szCs w:val="14"/>
-              </w:rPr>
-            </w:pPr>
-            <w:r>
-              <w:rPr>
-                <w:b w:val="0"/>
-                <w:sz w:val="14"/>
-              </w:rPr>
-              <w:t>7496.3</w:t>
+            <w:tcW w:type="dxa" w:w="753"/>
+            <w:noWrap/>
+            <w:vAlign w:val="center"/>
+          </w:tcPr>
+          <w:p>
+            <w:pPr>
+              <w:spacing w:before="0" w:after="0" w:line="240" w:lineRule="auto"/>
+              <w:jc w:val="center"/>
+              <w:rPr>
+                <w:sz w:val="14"/>
+                <w:szCs w:val="14"/>
+              </w:rPr>
+            </w:pPr>
+            <w:r>
+              <w:rPr>
+                <w:b w:val="0"/>
+                <w:sz w:val="14"/>
+              </w:rPr>
+              <w:t>7535.1</w:t>
             </w:r>
           </w:p>
         </w:tc>
@@ -21518,7 +21518,7 @@
                 <w:b w:val="0"/>
                 <w:sz w:val="14"/>
               </w:rPr>
-              <w:t>23024.6</w:t>
+              <w:t>22951.6</w:t>
             </w:r>
           </w:p>
         </w:tc>
@@ -21590,7 +21590,7 @@
                 <w:b w:val="0"/>
                 <w:sz w:val="14"/>
               </w:rPr>
-              <w:t>7983.8</w:t>
+              <w:t>7972.2</w:t>
             </w:r>
           </w:p>
         </w:tc>
@@ -21832,7 +21832,7 @@
                 <w:b w:val="0"/>
                 <w:sz w:val="14"/>
               </w:rPr>
-              <w:t>497.3</w:t>
+              <w:t>493.0</w:t>
             </w:r>
           </w:p>
         </w:tc>
@@ -21910,25 +21910,25 @@
         </w:tc>
         <w:tc>
           <w:tcPr>
-            <w:tcW w:type="dxa" w:w="756"/>
-            <w:noWrap/>
-            <w:vAlign w:val="center"/>
-          </w:tcPr>
-          <w:p>
-            <w:pPr>
-              <w:spacing w:before="0" w:after="0" w:line="240" w:lineRule="auto"/>
-              <w:jc w:val="center"/>
-              <w:rPr>
-                <w:sz w:val="14"/>
-                <w:szCs w:val="14"/>
-              </w:rPr>
-            </w:pPr>
-            <w:r>
-              <w:rPr>
-                <w:b w:val="0"/>
-                <w:sz w:val="14"/>
-              </w:rPr>
-              <w:t>6289.0</w:t>
+            <w:tcW w:type="dxa" w:w="753"/>
+            <w:noWrap/>
+            <w:vAlign w:val="center"/>
+          </w:tcPr>
+          <w:p>
+            <w:pPr>
+              <w:spacing w:before="0" w:after="0" w:line="240" w:lineRule="auto"/>
+              <w:jc w:val="center"/>
+              <w:rPr>
+                <w:sz w:val="14"/>
+                <w:szCs w:val="14"/>
+              </w:rPr>
+            </w:pPr>
+            <w:r>
+              <w:rPr>
+                <w:b w:val="0"/>
+                <w:sz w:val="14"/>
+              </w:rPr>
+              <w:t>6304.9</w:t>
             </w:r>
           </w:p>
         </w:tc>
@@ -21952,7 +21952,7 @@
                 <w:b w:val="0"/>
                 <w:sz w:val="14"/>
               </w:rPr>
-              <w:t>15040.8</w:t>
+              <w:t>14979.4</w:t>
             </w:r>
           </w:p>
         </w:tc>
@@ -22024,7 +22024,7 @@
                 <w:b w:val="0"/>
                 <w:sz w:val="14"/>
               </w:rPr>
-              <w:t>6914.0</w:t>
+              <w:t>6894.5</w:t>
             </w:r>
           </w:p>
         </w:tc>
@@ -22266,7 +22266,7 @@
                 <w:b w:val="0"/>
                 <w:sz w:val="14"/>
               </w:rPr>
-              <w:t>308.8</w:t>
+              <w:t>306.7</w:t>
             </w:r>
           </w:p>
         </w:tc>
@@ -22344,25 +22344,25 @@
         </w:tc>
         <w:tc>
           <w:tcPr>
-            <w:tcW w:type="dxa" w:w="756"/>
-            <w:noWrap/>
-            <w:vAlign w:val="center"/>
-          </w:tcPr>
-          <w:p>
-            <w:pPr>
-              <w:spacing w:before="0" w:after="0" w:line="240" w:lineRule="auto"/>
-              <w:jc w:val="center"/>
-              <w:rPr>
-                <w:sz w:val="14"/>
-                <w:szCs w:val="14"/>
-              </w:rPr>
-            </w:pPr>
-            <w:r>
-              <w:rPr>
-                <w:b w:val="0"/>
-                <w:sz w:val="14"/>
-              </w:rPr>
-              <w:t>4615.8</w:t>
+            <w:tcW w:type="dxa" w:w="753"/>
+            <w:noWrap/>
+            <w:vAlign w:val="center"/>
+          </w:tcPr>
+          <w:p>
+            <w:pPr>
+              <w:spacing w:before="0" w:after="0" w:line="240" w:lineRule="auto"/>
+              <w:jc w:val="center"/>
+              <w:rPr>
+                <w:sz w:val="14"/>
+                <w:szCs w:val="14"/>
+              </w:rPr>
+            </w:pPr>
+            <w:r>
+              <w:rPr>
+                <w:b w:val="0"/>
+                <w:sz w:val="14"/>
+              </w:rPr>
+              <w:t>4616.0</w:t>
             </w:r>
           </w:p>
         </w:tc>
@@ -22386,7 +22386,7 @@
                 <w:b w:val="0"/>
                 <w:sz w:val="14"/>
               </w:rPr>
-              <w:t>8126.7</w:t>
+              <w:t>8084.9</w:t>
             </w:r>
           </w:p>
         </w:tc>
@@ -22458,7 +22458,7 @@
                 <w:b w:val="0"/>
                 <w:sz w:val="14"/>
               </w:rPr>
-              <w:t>5264.2</w:t>
+              <w:t>5241.8</w:t>
             </w:r>
           </w:p>
         </w:tc>
@@ -22700,7 +22700,7 @@
                 <w:b w:val="0"/>
                 <w:sz w:val="14"/>
               </w:rPr>
-              <w:t>106.8</w:t>
+              <w:t>106.2</w:t>
             </w:r>
           </w:p>
         </w:tc>
@@ -22778,25 +22778,25 @@
         </w:tc>
         <w:tc>
           <w:tcPr>
-            <w:tcW w:type="dxa" w:w="756"/>
-            <w:noWrap/>
-            <w:vAlign w:val="center"/>
-          </w:tcPr>
-          <w:p>
-            <w:pPr>
-              <w:spacing w:before="0" w:after="0" w:line="240" w:lineRule="auto"/>
-              <w:jc w:val="center"/>
-              <w:rPr>
-                <w:sz w:val="14"/>
-                <w:szCs w:val="14"/>
-              </w:rPr>
-            </w:pPr>
-            <w:r>
-              <w:rPr>
-                <w:b w:val="0"/>
-                <w:sz w:val="14"/>
-              </w:rPr>
-              <w:t>2343.4</w:t>
+            <w:tcW w:type="dxa" w:w="753"/>
+            <w:noWrap/>
+            <w:vAlign w:val="center"/>
+          </w:tcPr>
+          <w:p>
+            <w:pPr>
+              <w:spacing w:before="0" w:after="0" w:line="240" w:lineRule="auto"/>
+              <w:jc w:val="center"/>
+              <w:rPr>
+                <w:sz w:val="14"/>
+                <w:szCs w:val="14"/>
+              </w:rPr>
+            </w:pPr>
+            <w:r>
+              <w:rPr>
+                <w:b w:val="0"/>
+                <w:sz w:val="14"/>
+              </w:rPr>
+              <w:t>2334.6</w:t>
             </w:r>
           </w:p>
         </w:tc>
@@ -22820,7 +22820,7 @@
                 <w:b w:val="0"/>
                 <w:sz w:val="14"/>
               </w:rPr>
-              <w:t>2862.6</w:t>
+              <w:t>2843.1</w:t>
             </w:r>
           </w:p>
         </w:tc>
@@ -22892,7 +22892,7 @@
                 <w:b w:val="0"/>
                 <w:sz w:val="14"/>
               </w:rPr>
-              <w:t>2862.6</w:t>
+              <w:t>2843.1</w:t>
             </w:r>
           </w:p>
         </w:tc>
@@ -23231,7 +23231,7 @@
         </w:tc>
         <w:tc>
           <w:tcPr>
-            <w:tcW w:type="dxa" w:w="756"/>
+            <w:tcW w:type="dxa" w:w="753"/>
             <w:tcBorders>
               <w:top w:val="single" w:sz="8" w:space="0" w:color="auto"/>
             </w:tcBorders>
@@ -23252,7 +23252,7 @@
                 <w:b/>
                 <w:sz w:val="14"/>
               </w:rPr>
-              <w:t>974746.7</w:t>
+              <w:t>982142.0</w:t>
             </w:r>
           </w:p>
         </w:tc>
@@ -26328,10 +26328,10 @@
         <w:rPr>
           <w:b/>
         </w:rPr>
-        <w:t>1.248</w:t>
+        <w:t>1.257</w:t>
       </w:r>
       <w:r>
-        <w:t xml:space="preserve"> with θ = -16.27 degrees. The force equation is the </w:t>
+        <w:t xml:space="preserve"> with θ = -16.28 degrees. The force equation is the </w:t>
       </w:r>
       <m:oMath>
         <m:sSub>
@@ -26405,7 +26405,7 @@
             </m:e>
           </m:nary>
           <m:r>
-            <m:t xml:space="preserve"> = -2.728e-11</m:t>
+            <m:t xml:space="preserve"> = -1.000e-11</m:t>
           </m:r>
         </m:oMath>
       </m:oMathPara>
@@ -26416,7 +26416,7 @@
         <w:keepNext w:val="0"/>
       </w:pPr>
       <w:r>
-        <w:t xml:space="preserve">That is one part in 13,560 trillion of the 369995 the magnitudes of Q come to. The moment equation weights the same column by </w:t>
+        <w:t xml:space="preserve">That is one part in 37,125 trillion of the 371418 the magnitudes of Q come to. The moment equation weights the same column by </w:t>
       </w:r>
       <m:oMath>
         <m:sSub>
@@ -26542,7 +26542,7 @@
             </m:e>
           </m:nary>
           <m:r>
-            <m:t xml:space="preserve"> = 6.752e-09</m:t>
+            <m:t xml:space="preserve"> = 5.355e-09</m:t>
           </m:r>
         </m:oMath>
       </m:oMathPara>
@@ -26553,7 +26553,7 @@
         <w:keepNext w:val="0"/>
       </w:pPr>
       <w:r>
-        <w:t>That is one part in 12,439 trillion of the 83989264 its moment terms come to. Sums re-formed from the printed, rounded columns carry that rounding and close to within a thousandth of these totals.</w:t>
+        <w:t>That is one part in 15,749 trillion of the 84337150 its moment terms come to. Sums re-formed from the printed, rounded columns carry that rounding and close to within a thousandth of these totals.</w:t>
       </w:r>
     </w:p>
     <w:p>
@@ -26572,7 +26572,7 @@
         <w:keepNext w:val="0"/>
       </w:pPr>
       <w:r>
-        <w:t>The factor of safety was computed by the shear strength reduction method. The shear strength of every material is divided by a trial factor — both the cohesion and the tangent of the friction angle — and the section is solved again at that reduced strength; the factor of safety is the largest reduction the section can withstand. Each trial is solved by the finite element method. Each material is linearly elastic below its Mohr-Coulomb yield surface and perfectly plastic on it, and the viscoplastic algorithm of Griffiths and Lane finds the stresses that satisfy equilibrium under gravity without exceeding that surface. No failure surface is assumed: where the section shears is an outcome of the solution. The critical factor is bracketed between a trial the section stands under and one it does not, and the bracket is halved until it is narrower than 0.01. The factor of safety is the midpoint of the final bracket, which spans 1.227 to 1.234. A trial that cannot reach equilibrium counts as failed unless its computed displacements both stayed at the elastic scale of that same trial and stopped growing. Where they did, the non-convergence is read as a failure to settle rather than a failure of the slope, and the trial is counted as standing.</w:t>
+        <w:t>The factor of safety was computed by the shear strength reduction method. The shear strength of every material is divided by a trial factor — both the cohesion and the tangent of the friction angle — and the section is solved again at that reduced strength; the factor of safety is the largest reduction the section can withstand. Each trial is solved by the finite element method. Each material is linearly elastic below its Mohr-Coulomb yield surface and perfectly plastic on it, and the viscoplastic algorithm of Griffiths and Lane finds the stresses that satisfy equilibrium under gravity without exceeding that surface. No failure surface is assumed: where the section shears is an outcome of the solution. The critical factor is bracketed between a trial the section stands under and one it does not, and the bracket is halved until it is narrower than 0.01. The factor of safety is the midpoint of the final bracket, which spans 1.242 to 1.250. A trial that cannot reach equilibrium counts as failed unless its computed displacements both stayed at the elastic scale of that same trial and stopped growing. Where they did, the non-convergence is read as a failure to settle rather than a failure of the slope, and the trial is counted as standing.</w:t>
       </w:r>
     </w:p>
     <w:p>
@@ -27686,7 +27686,7 @@
         <w:rPr>
           <w:b/>
         </w:rPr>
-        <w:t>1.230</w:t>
+        <w:t>1.246</w:t>
       </w:r>
       <w:r>
         <w:t xml:space="preserve">. The plots below show the mechanism at failure — the trial at which the section could not reach equilibrium. </w:t>

</xml_diff>